<commit_message>
vault backup: 2026-04-05 13:09:05
</commit_message>
<xml_diff>
--- a/こういちカンパニー/MIGAKI事業戦略/MIGAKI_創業計画書_最終版_2026-04-05.docx
+++ b/こういちカンパニー/MIGAKI事業戦略/MIGAKI_創業計画書_最終版_2026-04-05.docx
@@ -3756,7 +3756,7 @@
           <w:sz w:val="24"/>
           <w:szCs w:val="24"/>
         </w:rPr>
-        <w:t xml:space="preserve">3-3．MIGAKI NURSE（将来展開）</w:t>
+        <w:t xml:space="preserve">3-3．将来展開（コンテンツ収益・合宿企画）</w:t>
       </w:r>
     </w:p>
     <w:p>
@@ -3772,7 +3772,7 @@
           <w:sz w:val="20"/>
           <w:szCs w:val="20"/>
         </w:rPr>
-        <w:t xml:space="preserve">都市部の看護師と糸魚川・上越市の医療機関をつなぐマッチング事業。note読者1,200名がそのまま見込みユーザーになる。</w:t>
+        <w:t xml:space="preserve">MIGAKI BASE開業後の実績をnote・Xで発信し、有料マガジン収益とMIGAKI道場会員を拡大する。黒帯会員向け「不動心合宿」（年1回）の開催でリピーター基盤を構築する。看護師マッチング事業は現時点では対象外とし、基盤が安定した段階で改めて検討する。</w:t>
       </w:r>
     </w:p>
     <w:p>
@@ -7658,6 +7658,1069 @@
           <w:szCs w:val="20"/>
         </w:rPr>
         <w:t xml:space="preserve">→ 1年目から黒字。融資返済は1年目・2年目ともに収益の範囲内で完結できる。</w:t>
+      </w:r>
+    </w:p>
+    <w:p>
+      <w:r>
+        <w:rPr>
+          <w:sz w:val="20"/>
+          <w:szCs w:val="20"/>
+        </w:rPr>
+        <w:t xml:space="preserve"/>
+      </w:r>
+    </w:p>
+    <w:p>
+      <w:pPr>
+        <w:spacing w:after="80" w:before="240"/>
+      </w:pPr>
+      <w:r>
+        <w:rPr>
+          <w:rFonts w:ascii="Arial" w:cs="Arial" w:eastAsia="Arial" w:hAnsi="Arial"/>
+          <w:b/>
+          <w:bCs/>
+          <w:color w:val="2E75B6"/>
+          <w:sz w:val="24"/>
+          <w:szCs w:val="24"/>
+        </w:rPr>
+        <w:t xml:space="preserve">6-4．損益分岐点（BEP）分析</w:t>
+      </w:r>
+    </w:p>
+    <w:tbl>
+      <w:tblPr>
+        <w:tblW w:type="dxa" w:w="9638"/>
+        <w:tblBorders>
+          <w:top w:val="single" w:color="auto" w:sz="4"/>
+          <w:left w:val="single" w:color="auto" w:sz="4"/>
+          <w:bottom w:val="single" w:color="auto" w:sz="4"/>
+          <w:right w:val="single" w:color="auto" w:sz="4"/>
+          <w:insideH w:val="single" w:color="auto" w:sz="4"/>
+          <w:insideV w:val="single" w:color="auto" w:sz="4"/>
+        </w:tblBorders>
+      </w:tblPr>
+      <w:tblGrid>
+        <w:gridCol w:w="3200"/>
+        <w:gridCol w:w="2000"/>
+        <w:gridCol w:w="2200"/>
+        <w:gridCol w:w="2238"/>
+      </w:tblGrid>
+      <w:tr>
+        <w:tc>
+          <w:tcPr>
+            <w:tcW w:type="dxa" w:w="3200"/>
+            <w:gridSpan w:val="1"/>
+            <w:tcBorders>
+              <w:top w:val="single" w:color="1F3864" w:sz="1"/>
+              <w:left w:val="single" w:color="1F3864" w:sz="1"/>
+              <w:bottom w:val="single" w:color="1F3864" w:sz="1"/>
+              <w:right w:val="single" w:color="1F3864" w:sz="1"/>
+            </w:tcBorders>
+            <w:shd w:fill="1F3864" w:val="clear"/>
+            <w:tcMar>
+              <w:top w:type="dxa" w:w="80"/>
+              <w:left w:type="dxa" w:w="120"/>
+              <w:bottom w:type="dxa" w:w="80"/>
+              <w:right w:type="dxa" w:w="120"/>
+            </w:tcMar>
+          </w:tcPr>
+          <w:p>
+            <w:pPr>
+              <w:jc w:val="center"/>
+            </w:pPr>
+            <w:r>
+              <w:rPr>
+                <w:rFonts w:ascii="Arial" w:cs="Arial" w:eastAsia="Arial" w:hAnsi="Arial"/>
+                <w:b/>
+                <w:bCs/>
+                <w:color w:val="FFFFFF"/>
+                <w:sz w:val="20"/>
+                <w:szCs w:val="20"/>
+              </w:rPr>
+              <w:t xml:space="preserve">指標</w:t>
+            </w:r>
+          </w:p>
+        </w:tc>
+        <w:tc>
+          <w:tcPr>
+            <w:tcW w:type="dxa" w:w="2000"/>
+            <w:gridSpan w:val="1"/>
+            <w:tcBorders>
+              <w:top w:val="single" w:color="1F3864" w:sz="1"/>
+              <w:left w:val="single" w:color="1F3864" w:sz="1"/>
+              <w:bottom w:val="single" w:color="1F3864" w:sz="1"/>
+              <w:right w:val="single" w:color="1F3864" w:sz="1"/>
+            </w:tcBorders>
+            <w:shd w:fill="1F3864" w:val="clear"/>
+            <w:tcMar>
+              <w:top w:type="dxa" w:w="80"/>
+              <w:left w:type="dxa" w:w="120"/>
+              <w:bottom w:type="dxa" w:w="80"/>
+              <w:right w:type="dxa" w:w="120"/>
+            </w:tcMar>
+          </w:tcPr>
+          <w:p>
+            <w:pPr>
+              <w:jc w:val="center"/>
+            </w:pPr>
+            <w:r>
+              <w:rPr>
+                <w:rFonts w:ascii="Arial" w:cs="Arial" w:eastAsia="Arial" w:hAnsi="Arial"/>
+                <w:b/>
+                <w:bCs/>
+                <w:color w:val="FFFFFF"/>
+                <w:sz w:val="20"/>
+                <w:szCs w:val="20"/>
+              </w:rPr>
+              <w:t xml:space="preserve">保守</w:t>
+            </w:r>
+          </w:p>
+        </w:tc>
+        <w:tc>
+          <w:tcPr>
+            <w:tcW w:type="dxa" w:w="2200"/>
+            <w:gridSpan w:val="1"/>
+            <w:tcBorders>
+              <w:top w:val="single" w:color="1F3864" w:sz="1"/>
+              <w:left w:val="single" w:color="1F3864" w:sz="1"/>
+              <w:bottom w:val="single" w:color="1F3864" w:sz="1"/>
+              <w:right w:val="single" w:color="1F3864" w:sz="1"/>
+            </w:tcBorders>
+            <w:shd w:fill="1F3864" w:val="clear"/>
+            <w:tcMar>
+              <w:top w:type="dxa" w:w="80"/>
+              <w:left w:type="dxa" w:w="120"/>
+              <w:bottom w:type="dxa" w:w="80"/>
+              <w:right w:type="dxa" w:w="120"/>
+            </w:tcMar>
+          </w:tcPr>
+          <w:p>
+            <w:pPr>
+              <w:jc w:val="center"/>
+            </w:pPr>
+            <w:r>
+              <w:rPr>
+                <w:rFonts w:ascii="Arial" w:cs="Arial" w:eastAsia="Arial" w:hAnsi="Arial"/>
+                <w:b/>
+                <w:bCs/>
+                <w:color w:val="FFFFFF"/>
+                <w:sz w:val="20"/>
+                <w:szCs w:val="20"/>
+              </w:rPr>
+              <w:t xml:space="preserve">標準</w:t>
+            </w:r>
+          </w:p>
+        </w:tc>
+        <w:tc>
+          <w:tcPr>
+            <w:tcW w:type="dxa" w:w="2238"/>
+            <w:gridSpan w:val="1"/>
+            <w:tcBorders>
+              <w:top w:val="single" w:color="1F3864" w:sz="1"/>
+              <w:left w:val="single" w:color="1F3864" w:sz="1"/>
+              <w:bottom w:val="single" w:color="1F3864" w:sz="1"/>
+              <w:right w:val="single" w:color="1F3864" w:sz="1"/>
+            </w:tcBorders>
+            <w:shd w:fill="1F3864" w:val="clear"/>
+            <w:tcMar>
+              <w:top w:type="dxa" w:w="80"/>
+              <w:left w:type="dxa" w:w="120"/>
+              <w:bottom w:type="dxa" w:w="80"/>
+              <w:right w:type="dxa" w:w="120"/>
+            </w:tcMar>
+          </w:tcPr>
+          <w:p>
+            <w:pPr>
+              <w:jc w:val="center"/>
+            </w:pPr>
+            <w:r>
+              <w:rPr>
+                <w:rFonts w:ascii="Arial" w:cs="Arial" w:eastAsia="Arial" w:hAnsi="Arial"/>
+                <w:b/>
+                <w:bCs/>
+                <w:color w:val="FFFFFF"/>
+                <w:sz w:val="20"/>
+                <w:szCs w:val="20"/>
+              </w:rPr>
+              <w:t xml:space="preserve">楽観</w:t>
+            </w:r>
+          </w:p>
+        </w:tc>
+      </w:tr>
+      <w:tr>
+        <w:tc>
+          <w:tcPr>
+            <w:tcW w:type="dxa" w:w="3200"/>
+            <w:tcBorders>
+              <w:top w:val="single" w:color="BFBFBF" w:sz="1"/>
+              <w:left w:val="single" w:color="BFBFBF" w:sz="1"/>
+              <w:bottom w:val="single" w:color="BFBFBF" w:sz="1"/>
+              <w:right w:val="single" w:color="BFBFBF" w:sz="1"/>
+            </w:tcBorders>
+            <w:shd w:fill="EBF0FA" w:val="clear"/>
+            <w:tcMar>
+              <w:top w:type="dxa" w:w="80"/>
+              <w:left w:type="dxa" w:w="120"/>
+              <w:bottom w:type="dxa" w:w="80"/>
+              <w:right w:type="dxa" w:w="120"/>
+            </w:tcMar>
+            <w:vAlign w:val="center"/>
+          </w:tcPr>
+          <w:p>
+            <w:pPr>
+              <w:jc w:val="left"/>
+            </w:pPr>
+            <w:r>
+              <w:rPr>
+                <w:rFonts w:ascii="Arial" w:cs="Arial" w:eastAsia="Arial" w:hAnsi="Arial"/>
+                <w:b/>
+                <w:bCs/>
+                <w:color w:val="000000"/>
+                <w:sz w:val="20"/>
+                <w:szCs w:val="20"/>
+              </w:rPr>
+              <w:t xml:space="preserve">1泊単価</w:t>
+            </w:r>
+          </w:p>
+        </w:tc>
+        <w:tc>
+          <w:tcPr>
+            <w:tcW w:type="dxa" w:w="2000"/>
+            <w:tcBorders>
+              <w:top w:val="single" w:color="BFBFBF" w:sz="1"/>
+              <w:left w:val="single" w:color="BFBFBF" w:sz="1"/>
+              <w:bottom w:val="single" w:color="BFBFBF" w:sz="1"/>
+              <w:right w:val="single" w:color="BFBFBF" w:sz="1"/>
+            </w:tcBorders>
+            <w:shd w:fill="FFFFFF" w:val="clear"/>
+            <w:tcMar>
+              <w:top w:type="dxa" w:w="80"/>
+              <w:left w:type="dxa" w:w="120"/>
+              <w:bottom w:type="dxa" w:w="80"/>
+              <w:right w:type="dxa" w:w="120"/>
+            </w:tcMar>
+            <w:vAlign w:val="center"/>
+          </w:tcPr>
+          <w:p>
+            <w:pPr>
+              <w:jc w:val="center"/>
+            </w:pPr>
+            <w:r>
+              <w:rPr>
+                <w:rFonts w:ascii="Arial" w:cs="Arial" w:eastAsia="Arial" w:hAnsi="Arial"/>
+                <w:b w:val="false"/>
+                <w:bCs w:val="false"/>
+                <w:color w:val="000000"/>
+                <w:sz w:val="20"/>
+                <w:szCs w:val="20"/>
+              </w:rPr>
+              <w:t xml:space="preserve">¥50,000</w:t>
+            </w:r>
+          </w:p>
+        </w:tc>
+        <w:tc>
+          <w:tcPr>
+            <w:tcW w:type="dxa" w:w="2200"/>
+            <w:tcBorders>
+              <w:top w:val="single" w:color="BFBFBF" w:sz="1"/>
+              <w:left w:val="single" w:color="BFBFBF" w:sz="1"/>
+              <w:bottom w:val="single" w:color="BFBFBF" w:sz="1"/>
+              <w:right w:val="single" w:color="BFBFBF" w:sz="1"/>
+            </w:tcBorders>
+            <w:shd w:fill="FFFFFF" w:val="clear"/>
+            <w:tcMar>
+              <w:top w:type="dxa" w:w="80"/>
+              <w:left w:type="dxa" w:w="120"/>
+              <w:bottom w:type="dxa" w:w="80"/>
+              <w:right w:type="dxa" w:w="120"/>
+            </w:tcMar>
+            <w:vAlign w:val="center"/>
+          </w:tcPr>
+          <w:p>
+            <w:pPr>
+              <w:jc w:val="center"/>
+            </w:pPr>
+            <w:r>
+              <w:rPr>
+                <w:rFonts w:ascii="Arial" w:cs="Arial" w:eastAsia="Arial" w:hAnsi="Arial"/>
+                <w:b/>
+                <w:bCs/>
+                <w:color w:val="000000"/>
+                <w:sz w:val="20"/>
+                <w:szCs w:val="20"/>
+              </w:rPr>
+              <w:t xml:space="preserve">¥65,000</w:t>
+            </w:r>
+          </w:p>
+        </w:tc>
+        <w:tc>
+          <w:tcPr>
+            <w:tcW w:type="dxa" w:w="2238"/>
+            <w:tcBorders>
+              <w:top w:val="single" w:color="BFBFBF" w:sz="1"/>
+              <w:left w:val="single" w:color="BFBFBF" w:sz="1"/>
+              <w:bottom w:val="single" w:color="BFBFBF" w:sz="1"/>
+              <w:right w:val="single" w:color="BFBFBF" w:sz="1"/>
+            </w:tcBorders>
+            <w:shd w:fill="FFFFFF" w:val="clear"/>
+            <w:tcMar>
+              <w:top w:type="dxa" w:w="80"/>
+              <w:left w:type="dxa" w:w="120"/>
+              <w:bottom w:type="dxa" w:w="80"/>
+              <w:right w:type="dxa" w:w="120"/>
+            </w:tcMar>
+            <w:vAlign w:val="center"/>
+          </w:tcPr>
+          <w:p>
+            <w:pPr>
+              <w:jc w:val="center"/>
+            </w:pPr>
+            <w:r>
+              <w:rPr>
+                <w:rFonts w:ascii="Arial" w:cs="Arial" w:eastAsia="Arial" w:hAnsi="Arial"/>
+                <w:b w:val="false"/>
+                <w:bCs w:val="false"/>
+                <w:color w:val="000000"/>
+                <w:sz w:val="20"/>
+                <w:szCs w:val="20"/>
+              </w:rPr>
+              <w:t xml:space="preserve">¥85,000</w:t>
+            </w:r>
+          </w:p>
+        </w:tc>
+      </w:tr>
+      <w:tr>
+        <w:tc>
+          <w:tcPr>
+            <w:tcW w:type="dxa" w:w="3200"/>
+            <w:tcBorders>
+              <w:top w:val="single" w:color="BFBFBF" w:sz="1"/>
+              <w:left w:val="single" w:color="BFBFBF" w:sz="1"/>
+              <w:bottom w:val="single" w:color="BFBFBF" w:sz="1"/>
+              <w:right w:val="single" w:color="BFBFBF" w:sz="1"/>
+            </w:tcBorders>
+            <w:shd w:fill="EBF0FA" w:val="clear"/>
+            <w:tcMar>
+              <w:top w:type="dxa" w:w="80"/>
+              <w:left w:type="dxa" w:w="120"/>
+              <w:bottom w:type="dxa" w:w="80"/>
+              <w:right w:type="dxa" w:w="120"/>
+            </w:tcMar>
+            <w:vAlign w:val="center"/>
+          </w:tcPr>
+          <w:p>
+            <w:pPr>
+              <w:jc w:val="left"/>
+            </w:pPr>
+            <w:r>
+              <w:rPr>
+                <w:rFonts w:ascii="Arial" w:cs="Arial" w:eastAsia="Arial" w:hAnsi="Arial"/>
+                <w:b/>
+                <w:bCs/>
+                <w:color w:val="000000"/>
+                <w:sz w:val="20"/>
+                <w:szCs w:val="20"/>
+              </w:rPr>
+              <w:t xml:space="preserve">OTA手数料控除後（手取り）</w:t>
+            </w:r>
+          </w:p>
+        </w:tc>
+        <w:tc>
+          <w:tcPr>
+            <w:tcW w:type="dxa" w:w="2000"/>
+            <w:tcBorders>
+              <w:top w:val="single" w:color="BFBFBF" w:sz="1"/>
+              <w:left w:val="single" w:color="BFBFBF" w:sz="1"/>
+              <w:bottom w:val="single" w:color="BFBFBF" w:sz="1"/>
+              <w:right w:val="single" w:color="BFBFBF" w:sz="1"/>
+            </w:tcBorders>
+            <w:shd w:fill="FFFFFF" w:val="clear"/>
+            <w:tcMar>
+              <w:top w:type="dxa" w:w="80"/>
+              <w:left w:type="dxa" w:w="120"/>
+              <w:bottom w:type="dxa" w:w="80"/>
+              <w:right w:type="dxa" w:w="120"/>
+            </w:tcMar>
+            <w:vAlign w:val="center"/>
+          </w:tcPr>
+          <w:p>
+            <w:pPr>
+              <w:jc w:val="center"/>
+            </w:pPr>
+            <w:r>
+              <w:rPr>
+                <w:rFonts w:ascii="Arial" w:cs="Arial" w:eastAsia="Arial" w:hAnsi="Arial"/>
+                <w:b w:val="false"/>
+                <w:bCs w:val="false"/>
+                <w:color w:val="000000"/>
+                <w:sz w:val="20"/>
+                <w:szCs w:val="20"/>
+              </w:rPr>
+              <w:t xml:space="preserve">¥42,500</w:t>
+            </w:r>
+          </w:p>
+        </w:tc>
+        <w:tc>
+          <w:tcPr>
+            <w:tcW w:type="dxa" w:w="2200"/>
+            <w:tcBorders>
+              <w:top w:val="single" w:color="BFBFBF" w:sz="1"/>
+              <w:left w:val="single" w:color="BFBFBF" w:sz="1"/>
+              <w:bottom w:val="single" w:color="BFBFBF" w:sz="1"/>
+              <w:right w:val="single" w:color="BFBFBF" w:sz="1"/>
+            </w:tcBorders>
+            <w:shd w:fill="FFFFFF" w:val="clear"/>
+            <w:tcMar>
+              <w:top w:type="dxa" w:w="80"/>
+              <w:left w:type="dxa" w:w="120"/>
+              <w:bottom w:type="dxa" w:w="80"/>
+              <w:right w:type="dxa" w:w="120"/>
+            </w:tcMar>
+            <w:vAlign w:val="center"/>
+          </w:tcPr>
+          <w:p>
+            <w:pPr>
+              <w:jc w:val="center"/>
+            </w:pPr>
+            <w:r>
+              <w:rPr>
+                <w:rFonts w:ascii="Arial" w:cs="Arial" w:eastAsia="Arial" w:hAnsi="Arial"/>
+                <w:b/>
+                <w:bCs/>
+                <w:color w:val="000000"/>
+                <w:sz w:val="20"/>
+                <w:szCs w:val="20"/>
+              </w:rPr>
+              <w:t xml:space="preserve">¥55,250</w:t>
+            </w:r>
+          </w:p>
+        </w:tc>
+        <w:tc>
+          <w:tcPr>
+            <w:tcW w:type="dxa" w:w="2238"/>
+            <w:tcBorders>
+              <w:top w:val="single" w:color="BFBFBF" w:sz="1"/>
+              <w:left w:val="single" w:color="BFBFBF" w:sz="1"/>
+              <w:bottom w:val="single" w:color="BFBFBF" w:sz="1"/>
+              <w:right w:val="single" w:color="BFBFBF" w:sz="1"/>
+            </w:tcBorders>
+            <w:shd w:fill="FFFFFF" w:val="clear"/>
+            <w:tcMar>
+              <w:top w:type="dxa" w:w="80"/>
+              <w:left w:type="dxa" w:w="120"/>
+              <w:bottom w:type="dxa" w:w="80"/>
+              <w:right w:type="dxa" w:w="120"/>
+            </w:tcMar>
+            <w:vAlign w:val="center"/>
+          </w:tcPr>
+          <w:p>
+            <w:pPr>
+              <w:jc w:val="center"/>
+            </w:pPr>
+            <w:r>
+              <w:rPr>
+                <w:rFonts w:ascii="Arial" w:cs="Arial" w:eastAsia="Arial" w:hAnsi="Arial"/>
+                <w:b w:val="false"/>
+                <w:bCs w:val="false"/>
+                <w:color w:val="000000"/>
+                <w:sz w:val="20"/>
+                <w:szCs w:val="20"/>
+              </w:rPr>
+              <w:t xml:space="preserve">¥72,250</w:t>
+            </w:r>
+          </w:p>
+        </w:tc>
+      </w:tr>
+      <w:tr>
+        <w:tc>
+          <w:tcPr>
+            <w:tcW w:type="dxa" w:w="3200"/>
+            <w:tcBorders>
+              <w:top w:val="single" w:color="BFBFBF" w:sz="1"/>
+              <w:left w:val="single" w:color="BFBFBF" w:sz="1"/>
+              <w:bottom w:val="single" w:color="BFBFBF" w:sz="1"/>
+              <w:right w:val="single" w:color="BFBFBF" w:sz="1"/>
+            </w:tcBorders>
+            <w:shd w:fill="EBF0FA" w:val="clear"/>
+            <w:tcMar>
+              <w:top w:type="dxa" w:w="80"/>
+              <w:left w:type="dxa" w:w="120"/>
+              <w:bottom w:type="dxa" w:w="80"/>
+              <w:right w:type="dxa" w:w="120"/>
+            </w:tcMar>
+            <w:vAlign w:val="center"/>
+          </w:tcPr>
+          <w:p>
+            <w:pPr>
+              <w:jc w:val="left"/>
+            </w:pPr>
+            <w:r>
+              <w:rPr>
+                <w:rFonts w:ascii="Arial" w:cs="Arial" w:eastAsia="Arial" w:hAnsi="Arial"/>
+                <w:b/>
+                <w:bCs/>
+                <w:color w:val="000000"/>
+                <w:sz w:val="20"/>
+                <w:szCs w:val="20"/>
+              </w:rPr>
+              <w:t xml:space="preserve">月次固定費合計</w:t>
+            </w:r>
+          </w:p>
+        </w:tc>
+        <w:tc>
+          <w:tcPr>
+            <w:tcW w:type="dxa" w:w="2000"/>
+            <w:tcBorders>
+              <w:top w:val="single" w:color="BFBFBF" w:sz="1"/>
+              <w:left w:val="single" w:color="BFBFBF" w:sz="1"/>
+              <w:bottom w:val="single" w:color="BFBFBF" w:sz="1"/>
+              <w:right w:val="single" w:color="BFBFBF" w:sz="1"/>
+            </w:tcBorders>
+            <w:shd w:fill="FFFFFF" w:val="clear"/>
+            <w:tcMar>
+              <w:top w:type="dxa" w:w="80"/>
+              <w:left w:type="dxa" w:w="120"/>
+              <w:bottom w:type="dxa" w:w="80"/>
+              <w:right w:type="dxa" w:w="120"/>
+            </w:tcMar>
+            <w:vAlign w:val="center"/>
+          </w:tcPr>
+          <w:p>
+            <w:pPr>
+              <w:jc w:val="center"/>
+            </w:pPr>
+            <w:r>
+              <w:rPr>
+                <w:rFonts w:ascii="Arial" w:cs="Arial" w:eastAsia="Arial" w:hAnsi="Arial"/>
+                <w:b w:val="false"/>
+                <w:bCs w:val="false"/>
+                <w:color w:val="000000"/>
+                <w:sz w:val="20"/>
+                <w:szCs w:val="20"/>
+              </w:rPr>
+              <w:t xml:space="preserve">¥140,333</w:t>
+            </w:r>
+          </w:p>
+        </w:tc>
+        <w:tc>
+          <w:tcPr>
+            <w:tcW w:type="dxa" w:w="2200"/>
+            <w:tcBorders>
+              <w:top w:val="single" w:color="BFBFBF" w:sz="1"/>
+              <w:left w:val="single" w:color="BFBFBF" w:sz="1"/>
+              <w:bottom w:val="single" w:color="BFBFBF" w:sz="1"/>
+              <w:right w:val="single" w:color="BFBFBF" w:sz="1"/>
+            </w:tcBorders>
+            <w:shd w:fill="FFFFFF" w:val="clear"/>
+            <w:tcMar>
+              <w:top w:type="dxa" w:w="80"/>
+              <w:left w:type="dxa" w:w="120"/>
+              <w:bottom w:type="dxa" w:w="80"/>
+              <w:right w:type="dxa" w:w="120"/>
+            </w:tcMar>
+            <w:vAlign w:val="center"/>
+          </w:tcPr>
+          <w:p>
+            <w:pPr>
+              <w:jc w:val="center"/>
+            </w:pPr>
+            <w:r>
+              <w:rPr>
+                <w:rFonts w:ascii="Arial" w:cs="Arial" w:eastAsia="Arial" w:hAnsi="Arial"/>
+                <w:b w:val="false"/>
+                <w:bCs w:val="false"/>
+                <w:color w:val="000000"/>
+                <w:sz w:val="20"/>
+                <w:szCs w:val="20"/>
+              </w:rPr>
+              <w:t xml:space="preserve">¥140,333</w:t>
+            </w:r>
+          </w:p>
+        </w:tc>
+        <w:tc>
+          <w:tcPr>
+            <w:tcW w:type="dxa" w:w="2238"/>
+            <w:tcBorders>
+              <w:top w:val="single" w:color="BFBFBF" w:sz="1"/>
+              <w:left w:val="single" w:color="BFBFBF" w:sz="1"/>
+              <w:bottom w:val="single" w:color="BFBFBF" w:sz="1"/>
+              <w:right w:val="single" w:color="BFBFBF" w:sz="1"/>
+            </w:tcBorders>
+            <w:shd w:fill="FFFFFF" w:val="clear"/>
+            <w:tcMar>
+              <w:top w:type="dxa" w:w="80"/>
+              <w:left w:type="dxa" w:w="120"/>
+              <w:bottom w:type="dxa" w:w="80"/>
+              <w:right w:type="dxa" w:w="120"/>
+            </w:tcMar>
+            <w:vAlign w:val="center"/>
+          </w:tcPr>
+          <w:p>
+            <w:pPr>
+              <w:jc w:val="center"/>
+            </w:pPr>
+            <w:r>
+              <w:rPr>
+                <w:rFonts w:ascii="Arial" w:cs="Arial" w:eastAsia="Arial" w:hAnsi="Arial"/>
+                <w:b w:val="false"/>
+                <w:bCs w:val="false"/>
+                <w:color w:val="000000"/>
+                <w:sz w:val="20"/>
+                <w:szCs w:val="20"/>
+              </w:rPr>
+              <w:t xml:space="preserve">¥140,333</w:t>
+            </w:r>
+          </w:p>
+        </w:tc>
+      </w:tr>
+      <w:tr>
+        <w:tc>
+          <w:tcPr>
+            <w:tcW w:type="dxa" w:w="3200"/>
+            <w:tcBorders>
+              <w:top w:val="single" w:color="BFBFBF" w:sz="1"/>
+              <w:left w:val="single" w:color="BFBFBF" w:sz="1"/>
+              <w:bottom w:val="single" w:color="BFBFBF" w:sz="1"/>
+              <w:right w:val="single" w:color="BFBFBF" w:sz="1"/>
+            </w:tcBorders>
+            <w:shd w:fill="1F3864" w:val="clear"/>
+            <w:tcMar>
+              <w:top w:type="dxa" w:w="80"/>
+              <w:left w:type="dxa" w:w="120"/>
+              <w:bottom w:type="dxa" w:w="80"/>
+              <w:right w:type="dxa" w:w="120"/>
+            </w:tcMar>
+            <w:vAlign w:val="center"/>
+          </w:tcPr>
+          <w:p>
+            <w:pPr>
+              <w:jc w:val="left"/>
+            </w:pPr>
+            <w:r>
+              <w:rPr>
+                <w:rFonts w:ascii="Arial" w:cs="Arial" w:eastAsia="Arial" w:hAnsi="Arial"/>
+                <w:b/>
+                <w:bCs/>
+                <w:color w:val="FFFFFF"/>
+                <w:sz w:val="20"/>
+                <w:szCs w:val="20"/>
+              </w:rPr>
+              <w:t xml:space="preserve">損益分岐点（泊数/月）</w:t>
+            </w:r>
+          </w:p>
+        </w:tc>
+        <w:tc>
+          <w:tcPr>
+            <w:tcW w:type="dxa" w:w="2000"/>
+            <w:tcBorders>
+              <w:top w:val="single" w:color="BFBFBF" w:sz="1"/>
+              <w:left w:val="single" w:color="BFBFBF" w:sz="1"/>
+              <w:bottom w:val="single" w:color="BFBFBF" w:sz="1"/>
+              <w:right w:val="single" w:color="BFBFBF" w:sz="1"/>
+            </w:tcBorders>
+            <w:shd w:fill="2E75B6" w:val="clear"/>
+            <w:tcMar>
+              <w:top w:type="dxa" w:w="80"/>
+              <w:left w:type="dxa" w:w="120"/>
+              <w:bottom w:type="dxa" w:w="80"/>
+              <w:right w:type="dxa" w:w="120"/>
+            </w:tcMar>
+            <w:vAlign w:val="center"/>
+          </w:tcPr>
+          <w:p>
+            <w:pPr>
+              <w:jc w:val="center"/>
+            </w:pPr>
+            <w:r>
+              <w:rPr>
+                <w:rFonts w:ascii="Arial" w:cs="Arial" w:eastAsia="Arial" w:hAnsi="Arial"/>
+                <w:b/>
+                <w:bCs/>
+                <w:color w:val="FFFFFF"/>
+                <w:sz w:val="20"/>
+                <w:szCs w:val="20"/>
+              </w:rPr>
+              <w:t xml:space="preserve">4泊</w:t>
+            </w:r>
+          </w:p>
+        </w:tc>
+        <w:tc>
+          <w:tcPr>
+            <w:tcW w:type="dxa" w:w="2200"/>
+            <w:tcBorders>
+              <w:top w:val="single" w:color="BFBFBF" w:sz="1"/>
+              <w:left w:val="single" w:color="BFBFBF" w:sz="1"/>
+              <w:bottom w:val="single" w:color="BFBFBF" w:sz="1"/>
+              <w:right w:val="single" w:color="BFBFBF" w:sz="1"/>
+            </w:tcBorders>
+            <w:shd w:fill="2E75B6" w:val="clear"/>
+            <w:tcMar>
+              <w:top w:type="dxa" w:w="80"/>
+              <w:left w:type="dxa" w:w="120"/>
+              <w:bottom w:type="dxa" w:w="80"/>
+              <w:right w:type="dxa" w:w="120"/>
+            </w:tcMar>
+            <w:vAlign w:val="center"/>
+          </w:tcPr>
+          <w:p>
+            <w:pPr>
+              <w:jc w:val="center"/>
+            </w:pPr>
+            <w:r>
+              <w:rPr>
+                <w:rFonts w:ascii="Arial" w:cs="Arial" w:eastAsia="Arial" w:hAnsi="Arial"/>
+                <w:b/>
+                <w:bCs/>
+                <w:color w:val="FFFFFF"/>
+                <w:sz w:val="20"/>
+                <w:szCs w:val="20"/>
+              </w:rPr>
+              <w:t xml:space="preserve">3泊</w:t>
+            </w:r>
+          </w:p>
+        </w:tc>
+        <w:tc>
+          <w:tcPr>
+            <w:tcW w:type="dxa" w:w="2238"/>
+            <w:tcBorders>
+              <w:top w:val="single" w:color="BFBFBF" w:sz="1"/>
+              <w:left w:val="single" w:color="BFBFBF" w:sz="1"/>
+              <w:bottom w:val="single" w:color="BFBFBF" w:sz="1"/>
+              <w:right w:val="single" w:color="BFBFBF" w:sz="1"/>
+            </w:tcBorders>
+            <w:shd w:fill="2E75B6" w:val="clear"/>
+            <w:tcMar>
+              <w:top w:type="dxa" w:w="80"/>
+              <w:left w:type="dxa" w:w="120"/>
+              <w:bottom w:type="dxa" w:w="80"/>
+              <w:right w:type="dxa" w:w="120"/>
+            </w:tcMar>
+            <w:vAlign w:val="center"/>
+          </w:tcPr>
+          <w:p>
+            <w:pPr>
+              <w:jc w:val="center"/>
+            </w:pPr>
+            <w:r>
+              <w:rPr>
+                <w:rFonts w:ascii="Arial" w:cs="Arial" w:eastAsia="Arial" w:hAnsi="Arial"/>
+                <w:b/>
+                <w:bCs/>
+                <w:color w:val="FFFFFF"/>
+                <w:sz w:val="20"/>
+                <w:szCs w:val="20"/>
+              </w:rPr>
+              <w:t xml:space="preserve">2泊</w:t>
+            </w:r>
+          </w:p>
+        </w:tc>
+      </w:tr>
+      <w:tr>
+        <w:tc>
+          <w:tcPr>
+            <w:tcW w:type="dxa" w:w="3200"/>
+            <w:tcBorders>
+              <w:top w:val="single" w:color="BFBFBF" w:sz="1"/>
+              <w:left w:val="single" w:color="BFBFBF" w:sz="1"/>
+              <w:bottom w:val="single" w:color="BFBFBF" w:sz="1"/>
+              <w:right w:val="single" w:color="BFBFBF" w:sz="1"/>
+            </w:tcBorders>
+            <w:shd w:fill="EBF0FA" w:val="clear"/>
+            <w:tcMar>
+              <w:top w:type="dxa" w:w="80"/>
+              <w:left w:type="dxa" w:w="120"/>
+              <w:bottom w:type="dxa" w:w="80"/>
+              <w:right w:type="dxa" w:w="120"/>
+            </w:tcMar>
+            <w:vAlign w:val="center"/>
+          </w:tcPr>
+          <w:p>
+            <w:pPr>
+              <w:jc w:val="left"/>
+            </w:pPr>
+            <w:r>
+              <w:rPr>
+                <w:rFonts w:ascii="Arial" w:cs="Arial" w:eastAsia="Arial" w:hAnsi="Arial"/>
+                <w:b/>
+                <w:bCs/>
+                <w:color w:val="000000"/>
+                <w:sz w:val="20"/>
+                <w:szCs w:val="20"/>
+              </w:rPr>
+              <w:t xml:space="preserve">損益分岐点（稼働率換算）</w:t>
+            </w:r>
+          </w:p>
+        </w:tc>
+        <w:tc>
+          <w:tcPr>
+            <w:tcW w:type="dxa" w:w="2000"/>
+            <w:tcBorders>
+              <w:top w:val="single" w:color="BFBFBF" w:sz="1"/>
+              <w:left w:val="single" w:color="BFBFBF" w:sz="1"/>
+              <w:bottom w:val="single" w:color="BFBFBF" w:sz="1"/>
+              <w:right w:val="single" w:color="BFBFBF" w:sz="1"/>
+            </w:tcBorders>
+            <w:shd w:fill="FFFFFF" w:val="clear"/>
+            <w:tcMar>
+              <w:top w:type="dxa" w:w="80"/>
+              <w:left w:type="dxa" w:w="120"/>
+              <w:bottom w:type="dxa" w:w="80"/>
+              <w:right w:type="dxa" w:w="120"/>
+            </w:tcMar>
+            <w:vAlign w:val="center"/>
+          </w:tcPr>
+          <w:p>
+            <w:pPr>
+              <w:jc w:val="center"/>
+            </w:pPr>
+            <w:r>
+              <w:rPr>
+                <w:rFonts w:ascii="Arial" w:cs="Arial" w:eastAsia="Arial" w:hAnsi="Arial"/>
+                <w:b w:val="false"/>
+                <w:bCs w:val="false"/>
+                <w:color w:val="000000"/>
+                <w:sz w:val="20"/>
+                <w:szCs w:val="20"/>
+              </w:rPr>
+              <w:t xml:space="preserve">約13%</w:t>
+            </w:r>
+          </w:p>
+        </w:tc>
+        <w:tc>
+          <w:tcPr>
+            <w:tcW w:type="dxa" w:w="2200"/>
+            <w:tcBorders>
+              <w:top w:val="single" w:color="BFBFBF" w:sz="1"/>
+              <w:left w:val="single" w:color="BFBFBF" w:sz="1"/>
+              <w:bottom w:val="single" w:color="BFBFBF" w:sz="1"/>
+              <w:right w:val="single" w:color="BFBFBF" w:sz="1"/>
+            </w:tcBorders>
+            <w:shd w:fill="FFFFFF" w:val="clear"/>
+            <w:tcMar>
+              <w:top w:type="dxa" w:w="80"/>
+              <w:left w:type="dxa" w:w="120"/>
+              <w:bottom w:type="dxa" w:w="80"/>
+              <w:right w:type="dxa" w:w="120"/>
+            </w:tcMar>
+            <w:vAlign w:val="center"/>
+          </w:tcPr>
+          <w:p>
+            <w:pPr>
+              <w:jc w:val="center"/>
+            </w:pPr>
+            <w:r>
+              <w:rPr>
+                <w:rFonts w:ascii="Arial" w:cs="Arial" w:eastAsia="Arial" w:hAnsi="Arial"/>
+                <w:b/>
+                <w:bCs/>
+                <w:color w:val="000000"/>
+                <w:sz w:val="20"/>
+                <w:szCs w:val="20"/>
+              </w:rPr>
+              <w:t xml:space="preserve">約10%</w:t>
+            </w:r>
+          </w:p>
+        </w:tc>
+        <w:tc>
+          <w:tcPr>
+            <w:tcW w:type="dxa" w:w="2238"/>
+            <w:tcBorders>
+              <w:top w:val="single" w:color="BFBFBF" w:sz="1"/>
+              <w:left w:val="single" w:color="BFBFBF" w:sz="1"/>
+              <w:bottom w:val="single" w:color="BFBFBF" w:sz="1"/>
+              <w:right w:val="single" w:color="BFBFBF" w:sz="1"/>
+            </w:tcBorders>
+            <w:shd w:fill="FFFFFF" w:val="clear"/>
+            <w:tcMar>
+              <w:top w:type="dxa" w:w="80"/>
+              <w:left w:type="dxa" w:w="120"/>
+              <w:bottom w:type="dxa" w:w="80"/>
+              <w:right w:type="dxa" w:w="120"/>
+            </w:tcMar>
+            <w:vAlign w:val="center"/>
+          </w:tcPr>
+          <w:p>
+            <w:pPr>
+              <w:jc w:val="center"/>
+            </w:pPr>
+            <w:r>
+              <w:rPr>
+                <w:rFonts w:ascii="Arial" w:cs="Arial" w:eastAsia="Arial" w:hAnsi="Arial"/>
+                <w:b w:val="false"/>
+                <w:bCs w:val="false"/>
+                <w:color w:val="000000"/>
+                <w:sz w:val="20"/>
+                <w:szCs w:val="20"/>
+              </w:rPr>
+              <w:t xml:space="preserve">約7%</w:t>
+            </w:r>
+          </w:p>
+        </w:tc>
+      </w:tr>
+      <w:tr>
+        <w:tc>
+          <w:tcPr>
+            <w:tcW w:type="dxa" w:w="3200"/>
+            <w:tcBorders>
+              <w:top w:val="single" w:color="BFBFBF" w:sz="1"/>
+              <w:left w:val="single" w:color="BFBFBF" w:sz="1"/>
+              <w:bottom w:val="single" w:color="BFBFBF" w:sz="1"/>
+              <w:right w:val="single" w:color="BFBFBF" w:sz="1"/>
+            </w:tcBorders>
+            <w:shd w:fill="E2EFDA" w:val="clear"/>
+            <w:tcMar>
+              <w:top w:type="dxa" w:w="80"/>
+              <w:left w:type="dxa" w:w="120"/>
+              <w:bottom w:type="dxa" w:w="80"/>
+              <w:right w:type="dxa" w:w="120"/>
+            </w:tcMar>
+            <w:vAlign w:val="center"/>
+          </w:tcPr>
+          <w:p>
+            <w:pPr>
+              <w:jc w:val="left"/>
+            </w:pPr>
+            <w:r>
+              <w:rPr>
+                <w:rFonts w:ascii="Arial" w:cs="Arial" w:eastAsia="Arial" w:hAnsi="Arial"/>
+                <w:b/>
+                <w:bCs/>
+                <w:color w:val="000000"/>
+                <w:sz w:val="20"/>
+                <w:szCs w:val="20"/>
+              </w:rPr>
+              <w:t xml:space="preserve">閑散期最低稼働率（4月想定）</w:t>
+            </w:r>
+          </w:p>
+        </w:tc>
+        <w:tc>
+          <w:tcPr>
+            <w:tcW w:type="dxa" w:w="2000"/>
+            <w:tcBorders>
+              <w:top w:val="single" w:color="BFBFBF" w:sz="1"/>
+              <w:left w:val="single" w:color="BFBFBF" w:sz="1"/>
+              <w:bottom w:val="single" w:color="BFBFBF" w:sz="1"/>
+              <w:right w:val="single" w:color="BFBFBF" w:sz="1"/>
+            </w:tcBorders>
+            <w:shd w:fill="FFFFFF" w:val="clear"/>
+            <w:tcMar>
+              <w:top w:type="dxa" w:w="80"/>
+              <w:left w:type="dxa" w:w="120"/>
+              <w:bottom w:type="dxa" w:w="80"/>
+              <w:right w:type="dxa" w:w="120"/>
+            </w:tcMar>
+            <w:vAlign w:val="center"/>
+          </w:tcPr>
+          <w:p>
+            <w:pPr>
+              <w:jc w:val="center"/>
+            </w:pPr>
+            <w:r>
+              <w:rPr>
+                <w:rFonts w:ascii="Arial" w:cs="Arial" w:eastAsia="Arial" w:hAnsi="Arial"/>
+                <w:b w:val="false"/>
+                <w:bCs w:val="false"/>
+                <w:color w:val="000000"/>
+                <w:sz w:val="20"/>
+                <w:szCs w:val="20"/>
+              </w:rPr>
+              <w:t xml:space="preserve">20%（6泊）</w:t>
+            </w:r>
+          </w:p>
+        </w:tc>
+        <w:tc>
+          <w:tcPr>
+            <w:tcW w:type="dxa" w:w="2200"/>
+            <w:tcBorders>
+              <w:top w:val="single" w:color="BFBFBF" w:sz="1"/>
+              <w:left w:val="single" w:color="BFBFBF" w:sz="1"/>
+              <w:bottom w:val="single" w:color="BFBFBF" w:sz="1"/>
+              <w:right w:val="single" w:color="BFBFBF" w:sz="1"/>
+            </w:tcBorders>
+            <w:shd w:fill="FFFFFF" w:val="clear"/>
+            <w:tcMar>
+              <w:top w:type="dxa" w:w="80"/>
+              <w:left w:type="dxa" w:w="120"/>
+              <w:bottom w:type="dxa" w:w="80"/>
+              <w:right w:type="dxa" w:w="120"/>
+            </w:tcMar>
+            <w:vAlign w:val="center"/>
+          </w:tcPr>
+          <w:p>
+            <w:pPr>
+              <w:jc w:val="center"/>
+            </w:pPr>
+            <w:r>
+              <w:rPr>
+                <w:rFonts w:ascii="Arial" w:cs="Arial" w:eastAsia="Arial" w:hAnsi="Arial"/>
+                <w:b/>
+                <w:bCs/>
+                <w:color w:val="000000"/>
+                <w:sz w:val="20"/>
+                <w:szCs w:val="20"/>
+              </w:rPr>
+              <w:t xml:space="preserve">20%（6泊）</w:t>
+            </w:r>
+          </w:p>
+        </w:tc>
+        <w:tc>
+          <w:tcPr>
+            <w:tcW w:type="dxa" w:w="2238"/>
+            <w:tcBorders>
+              <w:top w:val="single" w:color="BFBFBF" w:sz="1"/>
+              <w:left w:val="single" w:color="BFBFBF" w:sz="1"/>
+              <w:bottom w:val="single" w:color="BFBFBF" w:sz="1"/>
+              <w:right w:val="single" w:color="BFBFBF" w:sz="1"/>
+            </w:tcBorders>
+            <w:shd w:fill="FFFFFF" w:val="clear"/>
+            <w:tcMar>
+              <w:top w:type="dxa" w:w="80"/>
+              <w:left w:type="dxa" w:w="120"/>
+              <w:bottom w:type="dxa" w:w="80"/>
+              <w:right w:type="dxa" w:w="120"/>
+            </w:tcMar>
+            <w:vAlign w:val="center"/>
+          </w:tcPr>
+          <w:p>
+            <w:pPr>
+              <w:jc w:val="center"/>
+            </w:pPr>
+            <w:r>
+              <w:rPr>
+                <w:rFonts w:ascii="Arial" w:cs="Arial" w:eastAsia="Arial" w:hAnsi="Arial"/>
+                <w:b w:val="false"/>
+                <w:bCs w:val="false"/>
+                <w:color w:val="000000"/>
+                <w:sz w:val="20"/>
+                <w:szCs w:val="20"/>
+              </w:rPr>
+              <w:t xml:space="preserve">20%（6泊）</w:t>
+            </w:r>
+          </w:p>
+        </w:tc>
+      </w:tr>
+    </w:tbl>
+    <w:p>
+      <w:r>
+        <w:rPr>
+          <w:sz w:val="20"/>
+          <w:szCs w:val="20"/>
+        </w:rPr>
+        <w:t xml:space="preserve"/>
+      </w:r>
+    </w:p>
+    <w:p>
+      <w:pPr>
+        <w:spacing w:after="60" w:before="60"/>
+      </w:pPr>
+      <w:r>
+        <w:rPr>
+          <w:rFonts w:ascii="Arial" w:cs="Arial" w:eastAsia="Arial" w:hAnsi="Arial"/>
+          <w:b/>
+          <w:bCs/>
+          <w:color w:val="375623"/>
+          <w:sz w:val="20"/>
+          <w:szCs w:val="20"/>
+        </w:rPr>
+        <w:t xml:space="preserve">▶ 標準シナリオでは月3泊（稼働率10%）で黒字化。閑散期でも20%稼働（6泊）を前提とすると、全シナリオで損益分岐点を超える。リスクは極めて低い。</w:t>
       </w:r>
     </w:p>
     <w:p>

</xml_diff>